<commit_message>
Make It Do Something
</commit_message>
<xml_diff>
--- a/Portfolio Design Review.docx
+++ b/Portfolio Design Review.docx
@@ -743,14 +743,17 @@
           <w:szCs w:val="24"/>
         </w:rPr>
       </w:pPr>
-      <w:r>
-        <w:rPr>
-          <w:rFonts w:ascii="Arial" w:hAnsi="Arial" w:cs="Arial"/>
-          <w:sz w:val="24"/>
-          <w:szCs w:val="24"/>
-        </w:rPr>
-        <w:t>https://portfolio-fatima-haroon.vercel.app/</w:t>
-      </w:r>
+      <w:hyperlink r:id="rId5" w:history="1">
+        <w:r>
+          <w:rPr>
+            <w:rStyle w:val="Hyperlink"/>
+            <w:rFonts w:ascii="Arial" w:hAnsi="Arial" w:cs="Arial"/>
+            <w:sz w:val="24"/>
+            <w:szCs w:val="24"/>
+          </w:rPr>
+          <w:t>https://portfolio-fatima-haroon.vercel.app/</w:t>
+        </w:r>
+      </w:hyperlink>
     </w:p>
     <w:p>
       <w:pPr>
@@ -2423,6 +2426,29 @@
       <w:spacing w:val="5"/>
     </w:rPr>
   </w:style>
+  <w:style w:type="character" w:styleId="Hyperlink">
+    <w:name w:val="Hyperlink"/>
+    <w:basedOn w:val="DefaultParagraphFont"/>
+    <w:uiPriority w:val="99"/>
+    <w:unhideWhenUsed/>
+    <w:rsid w:val="0048531D"/>
+    <w:rPr>
+      <w:color w:val="467886" w:themeColor="hyperlink"/>
+      <w:u w:val="single"/>
+    </w:rPr>
+  </w:style>
+  <w:style w:type="character" w:styleId="UnresolvedMention">
+    <w:name w:val="Unresolved Mention"/>
+    <w:basedOn w:val="DefaultParagraphFont"/>
+    <w:uiPriority w:val="99"/>
+    <w:semiHidden/>
+    <w:unhideWhenUsed/>
+    <w:rsid w:val="0048531D"/>
+    <w:rPr>
+      <w:color w:val="605E5C"/>
+      <w:shd w:val="clear" w:color="auto" w:fill="E1DFDD"/>
+    </w:rPr>
+  </w:style>
 </w:styles>
 </file>
 

</xml_diff>